<commit_message>
Keep picking labor closing terms and signatures on one page
</commit_message>
<xml_diff>
--- a/server/templates/picking-labor.docx
+++ b/server/templates/picking-labor.docx
@@ -339,32 +339,48 @@
     <w:p>
       <w:pPr>
         <w:pStyle w:val="Heading1"/>
+        <w:keepNext/>
       </w:pPr>
       <w:r>
         <w:t>十一、其他条款</w:t>
       </w:r>
     </w:p>
     <w:p>
+      <w:pPr>
+        <w:keepNext/>
+      </w:pPr>
       <w:r>
         <w:t>1. 本合同一式两份，甲乙双方各执一份，具有同等法律效力。</w:t>
       </w:r>
     </w:p>
     <w:p>
+      <w:pPr>
+        <w:keepNext/>
+      </w:pPr>
       <w:r>
         <w:t>2. 本合同未尽事宜，可由双方另行签订补充协议，补充协议与本合同具有同等法律效力。</w:t>
       </w:r>
     </w:p>
     <w:p>
+      <w:pPr>
+        <w:keepNext/>
+      </w:pPr>
       <w:r>
         <w:t>甲方（签字或盖章）：__________________</w:t>
       </w:r>
     </w:p>
     <w:p>
+      <w:pPr>
+        <w:keepNext/>
+      </w:pPr>
       <w:r>
         <w:t>日期：{{signDateA}}</w:t>
       </w:r>
     </w:p>
     <w:p>
+      <w:pPr>
+        <w:keepNext/>
+      </w:pPr>
       <w:r>
         <w:t>乙方（签字或盖章）：__________________</w:t>
       </w:r>

</xml_diff>